<commit_message>
Changes to generation, labels, report formating. 'Help' function is added
</commit_message>
<xml_diff>
--- a/report3.docx
+++ b/report3.docx
@@ -808,8 +808,13 @@
               <w:pStyle w:val="af5"/>
               <w:ind w:firstLine="0"/>
             </w:pPr>
+            <w:proofErr w:type="spellStart"/>
             <w:r>
-              <w:t>Дамрин А.О.</w:t>
+              <w:t>Дамрин</w:t>
+            </w:r>
+            <w:proofErr w:type="spellEnd"/>
+            <w:r>
+              <w:t xml:space="preserve"> А.О.</w:t>
             </w:r>
           </w:p>
         </w:tc>
@@ -1426,9 +1431,43 @@
       <w:r>
         <w:t xml:space="preserve"> </w:t>
       </w:r>
-      <w:r>
-        <w:t>InnoDB, MyISAM, Memory, CSV, Merge, Archive, Federated</w:t>
-      </w:r>
+      <w:proofErr w:type="spellStart"/>
+      <w:r>
+        <w:t>InnoDB</w:t>
+      </w:r>
+      <w:proofErr w:type="spellEnd"/>
+      <w:r>
+        <w:t xml:space="preserve">, </w:t>
+      </w:r>
+      <w:proofErr w:type="spellStart"/>
+      <w:r>
+        <w:t>MyISAM</w:t>
+      </w:r>
+      <w:proofErr w:type="spellEnd"/>
+      <w:r>
+        <w:t xml:space="preserve">, Memory, CSV, </w:t>
+      </w:r>
+      <w:proofErr w:type="spellStart"/>
+      <w:r>
+        <w:t>Merge</w:t>
+      </w:r>
+      <w:proofErr w:type="spellEnd"/>
+      <w:r>
+        <w:t xml:space="preserve">, </w:t>
+      </w:r>
+      <w:proofErr w:type="spellStart"/>
+      <w:r>
+        <w:t>Archive</w:t>
+      </w:r>
+      <w:proofErr w:type="spellEnd"/>
+      <w:r>
+        <w:t xml:space="preserve">, </w:t>
+      </w:r>
+      <w:proofErr w:type="spellStart"/>
+      <w:r>
+        <w:t>Federated</w:t>
+      </w:r>
+      <w:proofErr w:type="spellEnd"/>
       <w:r>
         <w:t>.</w:t>
       </w:r>
@@ -1581,8 +1620,77 @@
         <w:ind w:firstLine="708"/>
         <w:jc w:val="left"/>
       </w:pPr>
-      <w:r>
-        <w:t>Qt – это набор инструментов C++ для разработки приложений и графических пользовательских интерфейсов. Он подходит для встроенных систем как с пользовательским интерфейсом, так и без него. Qt поддерживает различные платформы, включая мобильные (Android, iOS), настольные (Windows, Linux, macOS) и встроенные (Embedded Linux, Embedded Android, Windows Embedded, QNX и т. д.).</w:t>
+      <w:proofErr w:type="spellStart"/>
+      <w:r>
+        <w:t>Qt</w:t>
+      </w:r>
+      <w:proofErr w:type="spellEnd"/>
+      <w:r>
+        <w:t xml:space="preserve"> – это набор инструментов C++ для разработки приложений и графических пользовательских интерфейсов. Он подходит для встроенных систем как с пользовательским интерфейсом, так и без него. </w:t>
+      </w:r>
+      <w:proofErr w:type="spellStart"/>
+      <w:r>
+        <w:t>Qt</w:t>
+      </w:r>
+      <w:proofErr w:type="spellEnd"/>
+      <w:r>
+        <w:t xml:space="preserve"> поддерживает различные платформы, включая мобильные (</w:t>
+      </w:r>
+      <w:proofErr w:type="spellStart"/>
+      <w:r>
+        <w:t>Android</w:t>
+      </w:r>
+      <w:proofErr w:type="spellEnd"/>
+      <w:r>
+        <w:t xml:space="preserve">, </w:t>
+      </w:r>
+      <w:proofErr w:type="spellStart"/>
+      <w:r>
+        <w:t>iOS</w:t>
+      </w:r>
+      <w:proofErr w:type="spellEnd"/>
+      <w:r>
+        <w:t xml:space="preserve">), настольные (Windows, Linux, </w:t>
+      </w:r>
+      <w:proofErr w:type="spellStart"/>
+      <w:r>
+        <w:t>macOS</w:t>
+      </w:r>
+      <w:proofErr w:type="spellEnd"/>
+      <w:r>
+        <w:t>) и встроенные (</w:t>
+      </w:r>
+      <w:proofErr w:type="spellStart"/>
+      <w:r>
+        <w:t>Embedded</w:t>
+      </w:r>
+      <w:proofErr w:type="spellEnd"/>
+      <w:r>
+        <w:t xml:space="preserve"> Linux, </w:t>
+      </w:r>
+      <w:proofErr w:type="spellStart"/>
+      <w:r>
+        <w:t>Embedded</w:t>
+      </w:r>
+      <w:proofErr w:type="spellEnd"/>
+      <w:r>
+        <w:t xml:space="preserve"> </w:t>
+      </w:r>
+      <w:proofErr w:type="spellStart"/>
+      <w:r>
+        <w:t>Android</w:t>
+      </w:r>
+      <w:proofErr w:type="spellEnd"/>
+      <w:r>
+        <w:t xml:space="preserve">, Windows </w:t>
+      </w:r>
+      <w:proofErr w:type="spellStart"/>
+      <w:r>
+        <w:t>Embedded</w:t>
+      </w:r>
+      <w:proofErr w:type="spellEnd"/>
+      <w:r>
+        <w:t>, QNX и т. д.).</w:t>
       </w:r>
     </w:p>
     <w:p>
@@ -1616,9 +1724,19 @@
         <w:ind w:firstLine="708"/>
         <w:jc w:val="left"/>
       </w:pPr>
-      <w:r>
-        <w:t>Qt Designer</w:t>
-      </w:r>
+      <w:proofErr w:type="spellStart"/>
+      <w:r>
+        <w:t>Qt</w:t>
+      </w:r>
+      <w:proofErr w:type="spellEnd"/>
+      <w:r>
+        <w:t xml:space="preserve"> </w:t>
+      </w:r>
+      <w:proofErr w:type="spellStart"/>
+      <w:r>
+        <w:t>Designer</w:t>
+      </w:r>
+      <w:proofErr w:type="spellEnd"/>
       <w:r>
         <w:t xml:space="preserve"> — это оригинальный встроенный дизайнер графического интерфейса. Его можно использовать и как самостоятельное средство. </w:t>
       </w:r>
@@ -1629,11 +1747,40 @@
       <w:r>
         <w:tab/>
       </w:r>
-      <w:r>
-        <w:t>Qt Design Studio</w:t>
-      </w:r>
-      <w:r>
-        <w:t xml:space="preserve"> — это урезанная версия Qt Creator. Среда предлагает набор 2D/3D-инструментов для создания интерфейсов UI/UX и HMI. Qt Design Studio позволяет дизайнерам и разработчикам повысить уровень взаимодействия, работая в одном фреймворке с одним общим языком. </w:t>
+      <w:proofErr w:type="spellStart"/>
+      <w:r>
+        <w:t>Qt</w:t>
+      </w:r>
+      <w:proofErr w:type="spellEnd"/>
+      <w:r>
+        <w:t xml:space="preserve"> Design Studio</w:t>
+      </w:r>
+      <w:r>
+        <w:t xml:space="preserve"> — это урезанная версия </w:t>
+      </w:r>
+      <w:proofErr w:type="spellStart"/>
+      <w:r>
+        <w:t>Qt</w:t>
+      </w:r>
+      <w:proofErr w:type="spellEnd"/>
+      <w:r>
+        <w:t xml:space="preserve"> </w:t>
+      </w:r>
+      <w:proofErr w:type="spellStart"/>
+      <w:r>
+        <w:t>Creator</w:t>
+      </w:r>
+      <w:proofErr w:type="spellEnd"/>
+      <w:r>
+        <w:t xml:space="preserve">. Среда предлагает набор 2D/3D-инструментов для создания интерфейсов UI/UX и HMI. </w:t>
+      </w:r>
+      <w:proofErr w:type="spellStart"/>
+      <w:r>
+        <w:t>Qt</w:t>
+      </w:r>
+      <w:proofErr w:type="spellEnd"/>
+      <w:r>
+        <w:t xml:space="preserve"> Design Studio позволяет дизайнерам и разработчикам повысить уровень взаимодействия, работая в одном фреймворке с одним общим языком. </w:t>
       </w:r>
       <w:r>
         <w:br/>
@@ -1646,7 +1793,15 @@
         <w:t>QML</w:t>
       </w:r>
       <w:r>
-        <w:t xml:space="preserve">, декларативный язык Qt, позволяет разработчикам легко и быстро создавать пользовательские интерфейсы. UI элементы, написанные на QML, можно интегрировать с логикой, написанной на C++. Кроме того, QML предоставляет очень удобный способ разработки пользовательских интерфейсов для сенсорных экранов. </w:t>
+        <w:t xml:space="preserve">, декларативный язык </w:t>
+      </w:r>
+      <w:proofErr w:type="spellStart"/>
+      <w:r>
+        <w:t>Qt</w:t>
+      </w:r>
+      <w:proofErr w:type="spellEnd"/>
+      <w:r>
+        <w:t xml:space="preserve">, позволяет разработчикам легко и быстро создавать пользовательские интерфейсы. UI элементы, написанные на QML, можно интегрировать с логикой, написанной на C++. Кроме того, QML предоставляет очень удобный способ разработки пользовательских интерфейсов для сенсорных экранов. </w:t>
       </w:r>
       <w:r>
         <w:br/>
@@ -1655,11 +1810,37 @@
       <w:r>
         <w:tab/>
       </w:r>
+      <w:proofErr w:type="spellStart"/>
       <w:r>
         <w:t>Qt</w:t>
       </w:r>
-      <w:r>
-        <w:t xml:space="preserve"> для микроконтроллеров, Qt for MCUs 2.0, предоставляет разработчикам полную графическую среду и все необходимые инструменты для успешного проектирования, разработки и развертывания графических интерфейсов на микроконтроллерах. </w:t>
+      <w:proofErr w:type="spellEnd"/>
+      <w:r>
+        <w:t xml:space="preserve"> для микроконтроллеров, </w:t>
+      </w:r>
+      <w:proofErr w:type="spellStart"/>
+      <w:r>
+        <w:t>Qt</w:t>
+      </w:r>
+      <w:proofErr w:type="spellEnd"/>
+      <w:r>
+        <w:t xml:space="preserve"> </w:t>
+      </w:r>
+      <w:proofErr w:type="spellStart"/>
+      <w:r>
+        <w:t>for</w:t>
+      </w:r>
+      <w:proofErr w:type="spellEnd"/>
+      <w:r>
+        <w:t xml:space="preserve"> </w:t>
+      </w:r>
+      <w:proofErr w:type="spellStart"/>
+      <w:r>
+        <w:t>MCUs</w:t>
+      </w:r>
+      <w:proofErr w:type="spellEnd"/>
+      <w:r>
+        <w:t xml:space="preserve"> 2.0, предоставляет разработчикам полную графическую среду и все необходимые инструменты для успешного проектирования, разработки и развертывания графических интерфейсов на микроконтроллерах. </w:t>
       </w:r>
     </w:p>
     <w:p>
@@ -1695,7 +1876,15 @@
         <w:t>1)</w:t>
       </w:r>
       <w:r>
-        <w:t xml:space="preserve">  Кроссплатформенность. Приложение может быть собрано под Windows, Linux и macOS с минимальными изменениями кода.</w:t>
+        <w:t xml:space="preserve">  Кроссплатформенность. Приложение может быть собрано под Windows, Linux и </w:t>
+      </w:r>
+      <w:proofErr w:type="spellStart"/>
+      <w:r>
+        <w:t>macOS</w:t>
+      </w:r>
+      <w:proofErr w:type="spellEnd"/>
+      <w:r>
+        <w:t xml:space="preserve"> с минимальными изменениями кода.</w:t>
       </w:r>
     </w:p>
     <w:p>
@@ -1717,7 +1906,15 @@
         <w:t>3)</w:t>
       </w:r>
       <w:r>
-        <w:t xml:space="preserve">  Интеграция с C++. Qt органично встраивается в C++-проекты и позволяет использовать объектно-ориентированный подход.</w:t>
+        <w:t xml:space="preserve">  Интеграция с C++. </w:t>
+      </w:r>
+      <w:proofErr w:type="spellStart"/>
+      <w:r>
+        <w:t>Qt</w:t>
+      </w:r>
+      <w:proofErr w:type="spellEnd"/>
+      <w:r>
+        <w:t xml:space="preserve"> органично встраивается в C++-проекты и позволяет использовать объектно-ориентированный подход.</w:t>
       </w:r>
     </w:p>
     <w:p>
@@ -1739,7 +1936,15 @@
         <w:t>5)</w:t>
       </w:r>
       <w:r>
-        <w:t xml:space="preserve">  Встроенная работа с БД. Модуль Qt SQL позволяет выполнять SQL-запросы напрямую из приложения.</w:t>
+        <w:t xml:space="preserve">  Встроенная работа с БД. Модуль </w:t>
+      </w:r>
+      <w:proofErr w:type="spellStart"/>
+      <w:r>
+        <w:t>Qt</w:t>
+      </w:r>
+      <w:proofErr w:type="spellEnd"/>
+      <w:r>
+        <w:t xml:space="preserve"> SQL позволяет выполнять SQL-запросы напрямую из приложения.</w:t>
       </w:r>
     </w:p>
     <w:p>
@@ -1775,7 +1980,15 @@
         <w:pStyle w:val="af5"/>
       </w:pPr>
       <w:r>
-        <w:t>1) Зависимость от среды сборки и версии Qt:</w:t>
+        <w:t xml:space="preserve">1) Зависимость от среды сборки и версии </w:t>
+      </w:r>
+      <w:proofErr w:type="spellStart"/>
+      <w:r>
+        <w:t>Qt</w:t>
+      </w:r>
+      <w:proofErr w:type="spellEnd"/>
+      <w:r>
+        <w:t>:</w:t>
       </w:r>
     </w:p>
     <w:p>
@@ -1789,14 +2002,67 @@
       <w:r>
         <w:t xml:space="preserve"> </w:t>
       </w:r>
-      <w:r>
-        <w:t>Qt-приложения чувствительны к версии фреймворка, компилятора и среды разработки. На практике это приводит к следующим проблемам:несовместимость проектов между разными версиями Qt (например, Qt 5 и Qt 6);</w:t>
+      <w:proofErr w:type="spellStart"/>
+      <w:r>
+        <w:t>Qt</w:t>
+      </w:r>
+      <w:proofErr w:type="spellEnd"/>
+      <w:r>
+        <w:t xml:space="preserve">-приложения чувствительны к версии фреймворка, компилятора и среды разработки. На практике это приводит к следующим </w:t>
+      </w:r>
+      <w:proofErr w:type="spellStart"/>
+      <w:r>
+        <w:t>проблемам:несовместимость</w:t>
+      </w:r>
+      <w:proofErr w:type="spellEnd"/>
+      <w:r>
+        <w:t xml:space="preserve"> проектов между разными версиями </w:t>
+      </w:r>
+      <w:proofErr w:type="spellStart"/>
+      <w:r>
+        <w:t>Qt</w:t>
+      </w:r>
+      <w:proofErr w:type="spellEnd"/>
+      <w:r>
+        <w:t xml:space="preserve"> (например, </w:t>
+      </w:r>
+      <w:proofErr w:type="spellStart"/>
+      <w:r>
+        <w:t>Qt</w:t>
+      </w:r>
+      <w:proofErr w:type="spellEnd"/>
+      <w:r>
+        <w:t xml:space="preserve"> 5 и </w:t>
+      </w:r>
+      <w:proofErr w:type="spellStart"/>
+      <w:r>
+        <w:t>Qt</w:t>
+      </w:r>
+      <w:proofErr w:type="spellEnd"/>
+      <w:r>
+        <w:t xml:space="preserve"> 6);</w:t>
       </w:r>
       <w:r>
         <w:t xml:space="preserve"> </w:t>
       </w:r>
       <w:r>
-        <w:t>необходимость точного соответствия версии компилятора (MinGW, MSVC) версии Qt;</w:t>
+        <w:t>необходимость точного соответствия версии компилятора (</w:t>
+      </w:r>
+      <w:proofErr w:type="spellStart"/>
+      <w:r>
+        <w:t>MinGW</w:t>
+      </w:r>
+      <w:proofErr w:type="spellEnd"/>
+      <w:r>
+        <w:t xml:space="preserve">, MSVC) версии </w:t>
+      </w:r>
+      <w:proofErr w:type="spellStart"/>
+      <w:r>
+        <w:t>Qt</w:t>
+      </w:r>
+      <w:proofErr w:type="spellEnd"/>
+      <w:r>
+        <w:t>;</w:t>
       </w:r>
       <w:r>
         <w:t xml:space="preserve"> </w:t>
@@ -1879,7 +2145,15 @@
         </w:numPr>
       </w:pPr>
       <w:r>
-        <w:t>необходимость включения динамических библиотек Qt;</w:t>
+        <w:t xml:space="preserve">необходимость включения динамических библиотек </w:t>
+      </w:r>
+      <w:proofErr w:type="spellStart"/>
+      <w:r>
+        <w:t>Qt</w:t>
+      </w:r>
+      <w:proofErr w:type="spellEnd"/>
+      <w:r>
+        <w:t>;</w:t>
       </w:r>
     </w:p>
     <w:p>
@@ -1891,7 +2165,15 @@
         </w:numPr>
       </w:pPr>
       <w:r>
-        <w:t>использование плагинов платформы (например, platforms/qwindows.dll);</w:t>
+        <w:t xml:space="preserve">использование плагинов платформы (например, </w:t>
+      </w:r>
+      <w:proofErr w:type="spellStart"/>
+      <w:r>
+        <w:t>platforms</w:t>
+      </w:r>
+      <w:proofErr w:type="spellEnd"/>
+      <w:r>
+        <w:t>/qwindows.dll);</w:t>
       </w:r>
     </w:p>
     <w:p>
@@ -1903,7 +2185,31 @@
         </w:numPr>
       </w:pPr>
       <w:r>
-        <w:t>подключение дополнительных модулей (Qt Widgets, Qt SQL и др.).</w:t>
+        <w:t>подключение дополнительных модулей (</w:t>
+      </w:r>
+      <w:proofErr w:type="spellStart"/>
+      <w:r>
+        <w:t>Qt</w:t>
+      </w:r>
+      <w:proofErr w:type="spellEnd"/>
+      <w:r>
+        <w:t xml:space="preserve"> </w:t>
+      </w:r>
+      <w:proofErr w:type="spellStart"/>
+      <w:r>
+        <w:t>Widgets</w:t>
+      </w:r>
+      <w:proofErr w:type="spellEnd"/>
+      <w:r>
+        <w:t xml:space="preserve">, </w:t>
+      </w:r>
+      <w:proofErr w:type="spellStart"/>
+      <w:r>
+        <w:t>Qt</w:t>
+      </w:r>
+      <w:proofErr w:type="spellEnd"/>
+      <w:r>
+        <w:t xml:space="preserve"> SQL и др.).</w:t>
       </w:r>
     </w:p>
     <w:p>
@@ -1922,8 +2228,13 @@
           <w:numId w:val="5"/>
         </w:numPr>
       </w:pPr>
-      <w:r>
-        <w:t>Qt распространяется под несколькими лицензиями, основными из которых являются:</w:t>
+      <w:proofErr w:type="spellStart"/>
+      <w:r>
+        <w:t>Qt</w:t>
+      </w:r>
+      <w:proofErr w:type="spellEnd"/>
+      <w:r>
+        <w:t xml:space="preserve"> распространяется под несколькими лицензиями, основными из которых являются:</w:t>
       </w:r>
     </w:p>
     <w:p>
@@ -1975,7 +2286,15 @@
         <w:t>3.2.1 П</w:t>
       </w:r>
       <w:r>
-        <w:t>редоставлять возможность замены библиотек Qt при использовании</w:t>
+        <w:t xml:space="preserve">редоставлять возможность замены библиотек </w:t>
+      </w:r>
+      <w:proofErr w:type="spellStart"/>
+      <w:r>
+        <w:t>Qt</w:t>
+      </w:r>
+      <w:proofErr w:type="spellEnd"/>
+      <w:r>
+        <w:t xml:space="preserve"> при использовании</w:t>
       </w:r>
       <w:r>
         <w:t xml:space="preserve"> </w:t>
@@ -2289,7 +2608,7 @@
     <w:p>
       <w:pPr>
         <w:pStyle w:val="af5"/>
-        <w:ind w:firstLine="0"/>
+        <w:ind w:firstLine="708"/>
         <w:jc w:val="left"/>
       </w:pPr>
       <w:r>
@@ -2306,6 +2625,12 @@
           <w:lang w:val="en-US"/>
         </w:rPr>
         <w:t>MySQL</w:t>
+      </w:r>
+      <w:r>
+        <w:t xml:space="preserve"> </w:t>
+      </w:r>
+      <w:r>
+        <w:t>(Рисунок 1)</w:t>
       </w:r>
       <w:r>
         <w:t>:</w:t>
@@ -2319,14 +2644,14 @@
       </w:pPr>
       <w:r>
         <w:rPr>
-          <w:noProof/>
-          <w:lang w:val="en-US"/>
+          <w:b/>
+          <w:bCs/>
         </w:rPr>
         <w:drawing>
-          <wp:inline distT="0" distB="0" distL="0" distR="0" wp14:anchorId="0D059117" wp14:editId="0ABD92C5">
-            <wp:extent cx="5940425" cy="4375785"/>
-            <wp:effectExtent l="0" t="0" r="3175" b="5715"/>
-            <wp:docPr id="527613230" name="Рисунок 1"/>
+          <wp:inline distT="0" distB="0" distL="0" distR="0" wp14:anchorId="629501D8" wp14:editId="0F9AB0EA">
+            <wp:extent cx="5940425" cy="4652645"/>
+            <wp:effectExtent l="0" t="0" r="3175" b="0"/>
+            <wp:docPr id="1388487275" name="Рисунок 1"/>
             <wp:cNvGraphicFramePr>
               <a:graphicFrameLocks xmlns:a="http://schemas.openxmlformats.org/drawingml/2006/main" noChangeAspect="1"/>
             </wp:cNvGraphicFramePr>
@@ -2334,7 +2659,7 @@
               <a:graphicData uri="http://schemas.openxmlformats.org/drawingml/2006/picture">
                 <pic:pic xmlns:pic="http://schemas.openxmlformats.org/drawingml/2006/picture">
                   <pic:nvPicPr>
-                    <pic:cNvPr id="527613230" name=""/>
+                    <pic:cNvPr id="1388487275" name=""/>
                     <pic:cNvPicPr/>
                   </pic:nvPicPr>
                   <pic:blipFill>
@@ -2346,7 +2671,7 @@
                   <pic:spPr>
                     <a:xfrm>
                       <a:off x="0" y="0"/>
-                      <a:ext cx="5940425" cy="4375785"/>
+                      <a:ext cx="5940425" cy="4652645"/>
                     </a:xfrm>
                     <a:prstGeom prst="rect">
                       <a:avLst/>
@@ -2557,7 +2882,6 @@
           <w:b/>
           <w:bCs/>
         </w:rPr>
-        <w:lastRenderedPageBreak/>
         <w:t xml:space="preserve">6 </w:t>
       </w:r>
       <w:r>
@@ -2764,16 +3088,6 @@
     <w:p>
       <w:pPr>
         <w:pStyle w:val="af5"/>
-        <w:ind w:firstLine="0"/>
-        <w:rPr>
-          <w:b/>
-          <w:bCs/>
-        </w:rPr>
-      </w:pPr>
-    </w:p>
-    <w:p>
-      <w:pPr>
-        <w:pStyle w:val="af5"/>
         <w:ind w:firstLine="708"/>
       </w:pPr>
       <w:r>
@@ -3073,29 +3387,46 @@
         <w:rPr>
           <w:b/>
           <w:bCs/>
-          <w:noProof/>
+        </w:rPr>
+        <w:t>Главное окно (авторизация пользователя)</w:t>
+      </w:r>
+      <w:r>
+        <w:rPr>
+          <w:b/>
+          <w:bCs/>
+        </w:rPr>
+        <w:t xml:space="preserve"> </w:t>
+      </w:r>
+      <w:r>
+        <w:t>показано на рисунке 5</w:t>
+      </w:r>
+      <w:r>
+        <w:rPr>
+          <w:b/>
+          <w:bCs/>
+        </w:rPr>
+        <w:t>.</w:t>
+      </w:r>
+    </w:p>
+    <w:p>
+      <w:pPr>
+        <w:pStyle w:val="af5"/>
+        <w:ind w:firstLine="0"/>
+        <w:rPr>
+          <w:b/>
+          <w:bCs/>
+        </w:rPr>
+      </w:pPr>
+      <w:r>
+        <w:rPr>
+          <w:b/>
+          <w:bCs/>
         </w:rPr>
         <w:drawing>
-          <wp:anchor distT="0" distB="0" distL="114300" distR="114300" simplePos="0" relativeHeight="251661312" behindDoc="1" locked="0" layoutInCell="1" allowOverlap="1" wp14:anchorId="7DE61C59" wp14:editId="30E71426">
-            <wp:simplePos x="0" y="0"/>
-            <wp:positionH relativeFrom="column">
-              <wp:posOffset>391160</wp:posOffset>
-            </wp:positionH>
-            <wp:positionV relativeFrom="paragraph">
-              <wp:posOffset>209550</wp:posOffset>
-            </wp:positionV>
-            <wp:extent cx="5663565" cy="3996055"/>
-            <wp:effectExtent l="0" t="0" r="0" b="4445"/>
-            <wp:wrapTight wrapText="bothSides">
-              <wp:wrapPolygon edited="0">
-                <wp:start x="0" y="0"/>
-                <wp:lineTo x="0" y="21521"/>
-                <wp:lineTo x="21506" y="21521"/>
-                <wp:lineTo x="21506" y="0"/>
-                <wp:lineTo x="0" y="0"/>
-              </wp:wrapPolygon>
-            </wp:wrapTight>
-            <wp:docPr id="1079218864" name="Рисунок 1"/>
+          <wp:inline distT="0" distB="0" distL="0" distR="0" wp14:anchorId="03257E80" wp14:editId="0BA1F34B">
+            <wp:extent cx="5940425" cy="4534535"/>
+            <wp:effectExtent l="0" t="0" r="3175" b="0"/>
+            <wp:docPr id="468862808" name="Рисунок 1"/>
             <wp:cNvGraphicFramePr>
               <a:graphicFrameLocks xmlns:a="http://schemas.openxmlformats.org/drawingml/2006/main" noChangeAspect="1"/>
             </wp:cNvGraphicFramePr>
@@ -3103,17 +3434,11 @@
               <a:graphicData uri="http://schemas.openxmlformats.org/drawingml/2006/picture">
                 <pic:pic xmlns:pic="http://schemas.openxmlformats.org/drawingml/2006/picture">
                   <pic:nvPicPr>
-                    <pic:cNvPr id="1079218864" name=""/>
+                    <pic:cNvPr id="468862808" name=""/>
                     <pic:cNvPicPr/>
                   </pic:nvPicPr>
                   <pic:blipFill>
-                    <a:blip r:embed="rId13" cstate="print">
-                      <a:extLst>
-                        <a:ext uri="{28A0092B-C50C-407E-A947-70E740481C1C}">
-                          <a14:useLocalDpi xmlns:a14="http://schemas.microsoft.com/office/drawing/2010/main" val="0"/>
-                        </a:ext>
-                      </a:extLst>
-                    </a:blip>
+                    <a:blip r:embed="rId13"/>
                     <a:stretch>
                       <a:fillRect/>
                     </a:stretch>
@@ -3121,7 +3446,7 @@
                   <pic:spPr>
                     <a:xfrm>
                       <a:off x="0" y="0"/>
-                      <a:ext cx="5663565" cy="3996055"/>
+                      <a:ext cx="5940425" cy="4534535"/>
                     </a:xfrm>
                     <a:prstGeom prst="rect">
                       <a:avLst/>
@@ -3130,61 +3455,37 @@
                 </pic:pic>
               </a:graphicData>
             </a:graphic>
-          </wp:anchor>
+          </wp:inline>
         </w:drawing>
       </w:r>
-      <w:r>
+    </w:p>
+    <w:p>
+      <w:pPr>
+        <w:pStyle w:val="af5"/>
+        <w:ind w:firstLine="0"/>
+        <w:jc w:val="center"/>
+      </w:pPr>
+      <w:r>
+        <w:t xml:space="preserve">Рисунок </w:t>
+      </w:r>
+      <w:r>
+        <w:t>5</w:t>
+      </w:r>
+      <w:r>
+        <w:t xml:space="preserve"> — </w:t>
+      </w:r>
+      <w:r>
+        <w:t>Главное окно приложения</w:t>
+      </w:r>
+    </w:p>
+    <w:p>
+      <w:pPr>
+        <w:pStyle w:val="af5"/>
+        <w:ind w:left="1080" w:firstLine="0"/>
         <w:rPr>
           <w:b/>
           <w:bCs/>
         </w:rPr>
-        <w:t>Главное окно (авторизация пользователя)</w:t>
-      </w:r>
-      <w:r>
-        <w:rPr>
-          <w:b/>
-          <w:bCs/>
-        </w:rPr>
-        <w:t xml:space="preserve"> </w:t>
-      </w:r>
-      <w:r>
-        <w:t>показано на рисунке 5</w:t>
-      </w:r>
-      <w:r>
-        <w:rPr>
-          <w:b/>
-          <w:bCs/>
-        </w:rPr>
-        <w:t>:</w:t>
-      </w:r>
-    </w:p>
-    <w:p>
-      <w:pPr>
-        <w:pStyle w:val="af5"/>
-        <w:ind w:left="1080" w:firstLine="0"/>
-        <w:jc w:val="center"/>
-      </w:pPr>
-      <w:r>
-        <w:t xml:space="preserve">Рисунок </w:t>
-      </w:r>
-      <w:r>
-        <w:t>5</w:t>
-      </w:r>
-      <w:r>
-        <w:t xml:space="preserve"> — </w:t>
-      </w:r>
-      <w:r>
-        <w:t>Главное окно приложения</w:t>
-      </w:r>
-    </w:p>
-    <w:p>
-      <w:pPr>
-        <w:pStyle w:val="af5"/>
-        <w:ind w:left="1080" w:firstLine="0"/>
-        <w:rPr>
-          <w:b/>
-          <w:bCs/>
-        </w:rPr>
       </w:pPr>
     </w:p>
     <w:p>
@@ -3204,21 +3505,25 @@
       <w:r>
         <w:t xml:space="preserve">: </w:t>
       </w:r>
+      <w:proofErr w:type="spellStart"/>
       <w:r>
         <w:rPr>
           <w:lang w:val="en-US"/>
         </w:rPr>
         <w:t>QLineEdit</w:t>
       </w:r>
+      <w:proofErr w:type="spellEnd"/>
       <w:r>
         <w:t xml:space="preserve"> для ввода текста и </w:t>
       </w:r>
+      <w:proofErr w:type="spellStart"/>
       <w:r>
         <w:rPr>
           <w:lang w:val="en-US"/>
         </w:rPr>
         <w:t>QPushButton</w:t>
       </w:r>
+      <w:proofErr w:type="spellEnd"/>
       <w:r>
         <w:t xml:space="preserve"> для выполнения действий.</w:t>
       </w:r>
@@ -3256,19 +3561,7 @@
     <w:p>
       <w:pPr>
         <w:pStyle w:val="af5"/>
-        <w:ind w:firstLine="708"/>
-      </w:pPr>
-    </w:p>
-    <w:p>
-      <w:pPr>
-        <w:pStyle w:val="af5"/>
-        <w:ind w:firstLine="708"/>
-      </w:pPr>
-    </w:p>
-    <w:p>
-      <w:pPr>
-        <w:pStyle w:val="af5"/>
-        <w:ind w:firstLine="708"/>
+        <w:ind w:firstLine="0"/>
       </w:pPr>
     </w:p>
     <w:p>
@@ -3287,31 +3580,72 @@
         <w:rPr>
           <w:b/>
           <w:bCs/>
-          <w:noProof/>
-          <w:lang w:val="en-US"/>
         </w:rPr>
         <w:lastRenderedPageBreak/>
+        <w:t>Окно сортировки массива</w:t>
+      </w:r>
+      <w:r>
+        <w:rPr>
+          <w:b/>
+          <w:bCs/>
+        </w:rPr>
+        <w:t xml:space="preserve"> </w:t>
+      </w:r>
+      <w:r>
+        <w:rPr>
+          <w:b/>
+          <w:bCs/>
+        </w:rPr>
+        <w:t xml:space="preserve">показано на </w:t>
+      </w:r>
+      <w:r>
+        <w:rPr>
+          <w:b/>
+          <w:bCs/>
+        </w:rPr>
+        <w:t>рисунк</w:t>
+      </w:r>
+      <w:r>
+        <w:rPr>
+          <w:b/>
+          <w:bCs/>
+        </w:rPr>
+        <w:t>е</w:t>
+      </w:r>
+      <w:r>
+        <w:rPr>
+          <w:b/>
+          <w:bCs/>
+        </w:rPr>
+        <w:t xml:space="preserve"> 6</w:t>
+      </w:r>
+      <w:r>
+        <w:rPr>
+          <w:b/>
+          <w:bCs/>
+        </w:rPr>
+        <w:t>.</w:t>
+      </w:r>
+    </w:p>
+    <w:p>
+      <w:pPr>
+        <w:pStyle w:val="af5"/>
+        <w:ind w:firstLine="0"/>
+        <w:rPr>
+          <w:b/>
+          <w:bCs/>
+        </w:rPr>
+      </w:pPr>
+      <w:r>
+        <w:rPr>
+          <w:b/>
+          <w:bCs/>
+        </w:rPr>
         <w:drawing>
-          <wp:anchor distT="0" distB="0" distL="114300" distR="114300" simplePos="0" relativeHeight="251660288" behindDoc="1" locked="0" layoutInCell="1" allowOverlap="1" wp14:anchorId="23C78C1F" wp14:editId="16C3BDBC">
-            <wp:simplePos x="0" y="0"/>
-            <wp:positionH relativeFrom="column">
-              <wp:posOffset>12700</wp:posOffset>
-            </wp:positionH>
-            <wp:positionV relativeFrom="paragraph">
-              <wp:posOffset>280035</wp:posOffset>
-            </wp:positionV>
-            <wp:extent cx="5940425" cy="3698240"/>
-            <wp:effectExtent l="0" t="0" r="3175" b="0"/>
-            <wp:wrapTight wrapText="bothSides">
-              <wp:wrapPolygon edited="0">
-                <wp:start x="0" y="0"/>
-                <wp:lineTo x="0" y="21474"/>
-                <wp:lineTo x="21542" y="21474"/>
-                <wp:lineTo x="21542" y="0"/>
-                <wp:lineTo x="0" y="0"/>
-              </wp:wrapPolygon>
-            </wp:wrapTight>
-            <wp:docPr id="989370108" name="Рисунок 1"/>
+          <wp:inline distT="0" distB="0" distL="0" distR="0" wp14:anchorId="44A7A8AC" wp14:editId="376570C8">
+            <wp:extent cx="5940425" cy="3710305"/>
+            <wp:effectExtent l="0" t="0" r="3175" b="4445"/>
+            <wp:docPr id="1002891905" name="Рисунок 1"/>
             <wp:cNvGraphicFramePr>
               <a:graphicFrameLocks xmlns:a="http://schemas.openxmlformats.org/drawingml/2006/main" noChangeAspect="1"/>
             </wp:cNvGraphicFramePr>
@@ -3319,17 +3653,11 @@
               <a:graphicData uri="http://schemas.openxmlformats.org/drawingml/2006/picture">
                 <pic:pic xmlns:pic="http://schemas.openxmlformats.org/drawingml/2006/picture">
                   <pic:nvPicPr>
-                    <pic:cNvPr id="989370108" name=""/>
+                    <pic:cNvPr id="1002891905" name=""/>
                     <pic:cNvPicPr/>
                   </pic:nvPicPr>
                   <pic:blipFill>
-                    <a:blip r:embed="rId14" cstate="print">
-                      <a:extLst>
-                        <a:ext uri="{28A0092B-C50C-407E-A947-70E740481C1C}">
-                          <a14:useLocalDpi xmlns:a14="http://schemas.microsoft.com/office/drawing/2010/main" val="0"/>
-                        </a:ext>
-                      </a:extLst>
-                    </a:blip>
+                    <a:blip r:embed="rId14"/>
                     <a:stretch>
                       <a:fillRect/>
                     </a:stretch>
@@ -3337,7 +3665,7 @@
                   <pic:spPr>
                     <a:xfrm>
                       <a:off x="0" y="0"/>
-                      <a:ext cx="5940425" cy="3698240"/>
+                      <a:ext cx="5940425" cy="3710305"/>
                     </a:xfrm>
                     <a:prstGeom prst="rect">
                       <a:avLst/>
@@ -3346,105 +3674,79 @@
                 </pic:pic>
               </a:graphicData>
             </a:graphic>
-          </wp:anchor>
+          </wp:inline>
         </w:drawing>
       </w:r>
-      <w:r>
-        <w:rPr>
-          <w:b/>
-          <w:bCs/>
-        </w:rPr>
-        <w:t>Окно сортировки массива</w:t>
-      </w:r>
-      <w:r>
+    </w:p>
+    <w:p>
+      <w:pPr>
+        <w:pStyle w:val="af5"/>
+        <w:ind w:firstLine="0"/>
+        <w:jc w:val="center"/>
+      </w:pPr>
+      <w:r>
+        <w:t xml:space="preserve">Рисунок </w:t>
+      </w:r>
+      <w:r>
+        <w:rPr>
+          <w:lang w:val="en-US"/>
+        </w:rPr>
+        <w:t>6</w:t>
+      </w:r>
+      <w:r>
+        <w:t xml:space="preserve"> — </w:t>
+      </w:r>
+      <w:r>
+        <w:t>Окно сортировки</w:t>
+      </w:r>
+    </w:p>
+    <w:p>
+      <w:pPr>
+        <w:pStyle w:val="af5"/>
+        <w:ind w:left="1440" w:firstLine="0"/>
         <w:rPr>
           <w:b/>
           <w:bCs/>
           <w:lang w:val="en-US"/>
         </w:rPr>
-        <w:t xml:space="preserve"> </w:t>
-      </w:r>
-      <w:r>
-        <w:rPr>
-          <w:b/>
-          <w:bCs/>
-        </w:rPr>
-        <w:t>(рисунок 6)</w:t>
-      </w:r>
-      <w:r>
-        <w:rPr>
-          <w:b/>
-          <w:bCs/>
+      </w:pPr>
+    </w:p>
+    <w:p>
+      <w:pPr>
+        <w:pStyle w:val="af5"/>
+        <w:ind w:firstLine="708"/>
+      </w:pPr>
+      <w:r>
+        <w:t xml:space="preserve">Окно сортировки является основным рабочим окном приложения. В верхней части отображается заголовок, далее расположена панель управления с кнопками очистки таблицы и генерации массива. Центральную часть занимает табличный вид массива, реализованный с помощью </w:t>
+      </w:r>
+      <w:proofErr w:type="spellStart"/>
+      <w:r>
+        <w:rPr>
           <w:lang w:val="en-US"/>
         </w:rPr>
-        <w:t>:</w:t>
-      </w:r>
-    </w:p>
-    <w:p>
-      <w:pPr>
-        <w:pStyle w:val="af5"/>
-        <w:ind w:left="720" w:firstLine="0"/>
-        <w:jc w:val="center"/>
-      </w:pPr>
-      <w:r>
-        <w:t xml:space="preserve">Рисунок </w:t>
-      </w:r>
+        <w:t>QTableWidget</w:t>
+      </w:r>
+      <w:proofErr w:type="spellEnd"/>
+      <w:r>
+        <w:t>.</w:t>
+      </w:r>
+    </w:p>
+    <w:p>
+      <w:pPr>
+        <w:pStyle w:val="af5"/>
+        <w:ind w:firstLine="708"/>
+      </w:pPr>
+      <w:r>
+        <w:t xml:space="preserve">Ввод элементов массива осуществляется последовательно. Для каждой ячейки используется числовой редактор </w:t>
+      </w:r>
+      <w:proofErr w:type="spellStart"/>
       <w:r>
         <w:rPr>
           <w:lang w:val="en-US"/>
         </w:rPr>
-        <w:t>6</w:t>
-      </w:r>
-      <w:r>
-        <w:t xml:space="preserve"> — </w:t>
-      </w:r>
-      <w:r>
-        <w:t>Окно сортировки</w:t>
-      </w:r>
-    </w:p>
-    <w:p>
-      <w:pPr>
-        <w:pStyle w:val="af5"/>
-        <w:ind w:left="1440" w:firstLine="0"/>
-        <w:rPr>
-          <w:b/>
-          <w:bCs/>
-          <w:lang w:val="en-US"/>
-        </w:rPr>
-      </w:pPr>
-    </w:p>
-    <w:p>
-      <w:pPr>
-        <w:pStyle w:val="af5"/>
-        <w:ind w:firstLine="708"/>
-      </w:pPr>
-      <w:r>
-        <w:t xml:space="preserve">Окно сортировки является основным рабочим окном приложения. В верхней части отображается заголовок, далее расположена панель управления с кнопками очистки таблицы и генерации массива. Центральную часть занимает табличный вид массива, реализованный с помощью </w:t>
-      </w:r>
-      <w:r>
-        <w:rPr>
-          <w:lang w:val="en-US"/>
-        </w:rPr>
-        <w:t>QTableWidget</w:t>
-      </w:r>
-      <w:r>
-        <w:t>.</w:t>
-      </w:r>
-    </w:p>
-    <w:p>
-      <w:pPr>
-        <w:pStyle w:val="af5"/>
-        <w:ind w:firstLine="708"/>
-      </w:pPr>
-      <w:r>
-        <w:t xml:space="preserve">Ввод элементов массива осуществляется последовательно. Для каждой ячейки используется числовой редактор </w:t>
-      </w:r>
-      <w:r>
-        <w:rPr>
-          <w:lang w:val="en-US"/>
-        </w:rPr>
         <w:t>QSpinBox</w:t>
       </w:r>
+      <w:proofErr w:type="spellEnd"/>
       <w:r>
         <w:t>, что предотвращает ввод некорректных данных и реализует эвристику предотвращения ошибок. Заблокированные ячейки визуально ограничивают возможные действия пользователя.</w:t>
       </w:r>
@@ -3559,7 +3861,28 @@
           <w:b/>
           <w:bCs/>
         </w:rPr>
-        <w:t>(рисунок 7)</w:t>
+        <w:t xml:space="preserve">показан на </w:t>
+      </w:r>
+      <w:r>
+        <w:rPr>
+          <w:b/>
+          <w:bCs/>
+        </w:rPr>
+        <w:t>рисунк</w:t>
+      </w:r>
+      <w:r>
+        <w:rPr>
+          <w:b/>
+          <w:bCs/>
+        </w:rPr>
+        <w:t>е</w:t>
+      </w:r>
+      <w:r>
+        <w:rPr>
+          <w:b/>
+          <w:bCs/>
+        </w:rPr>
+        <w:t xml:space="preserve"> 7</w:t>
       </w:r>
       <w:r>
         <w:rPr>
@@ -3670,21 +3993,18 @@
     </w:p>
     <w:p>
       <w:pPr>
-        <w:pStyle w:val="af5"/>
-        <w:ind w:firstLine="708"/>
-      </w:pPr>
-    </w:p>
-    <w:p>
-      <w:pPr>
-        <w:pStyle w:val="af5"/>
-        <w:ind w:firstLine="708"/>
-      </w:pPr>
-    </w:p>
-    <w:p>
-      <w:pPr>
-        <w:pStyle w:val="af5"/>
-        <w:ind w:firstLine="708"/>
-      </w:pPr>
+        <w:spacing w:after="0" w:line="240" w:lineRule="auto"/>
+        <w:rPr>
+          <w:rFonts w:ascii="Times New Roman" w:eastAsia="SimSun" w:hAnsi="Times New Roman" w:cs="Arial"/>
+          <w:kern w:val="1"/>
+          <w:sz w:val="24"/>
+          <w:szCs w:val="24"/>
+          <w:lang w:eastAsia="zh-CN" w:bidi="hi-IN"/>
+        </w:rPr>
+      </w:pPr>
+      <w:r>
+        <w:br w:type="page"/>
+      </w:r>
     </w:p>
     <w:p>
       <w:pPr>
@@ -3703,7 +4023,7 @@
         </w:rPr>
         <w:lastRenderedPageBreak/>
         <w:drawing>
-          <wp:anchor distT="0" distB="0" distL="114300" distR="114300" simplePos="0" relativeHeight="251662336" behindDoc="1" locked="0" layoutInCell="1" allowOverlap="1" wp14:anchorId="64B5D31F" wp14:editId="7989A760">
+          <wp:anchor distT="0" distB="0" distL="114300" distR="114300" simplePos="0" relativeHeight="251662336" behindDoc="1" locked="0" layoutInCell="1" allowOverlap="1" wp14:anchorId="64B5D31F" wp14:editId="15A3FFC7">
             <wp:simplePos x="0" y="0"/>
             <wp:positionH relativeFrom="column">
               <wp:posOffset>-32385</wp:posOffset>
@@ -3791,13 +4111,6 @@
         </w:rPr>
         <w:t xml:space="preserve"> (рисунок 8)</w:t>
       </w:r>
-      <w:r>
-        <w:rPr>
-          <w:b/>
-          <w:bCs/>
-        </w:rPr>
-        <w:t>:</w:t>
-      </w:r>
     </w:p>
     <w:p>
       <w:pPr>
@@ -3821,21 +4134,24 @@
     <w:p>
       <w:pPr>
         <w:pStyle w:val="af5"/>
+        <w:ind w:left="720" w:firstLine="0"/>
+        <w:jc w:val="center"/>
+      </w:pPr>
+    </w:p>
+    <w:p>
+      <w:pPr>
+        <w:pStyle w:val="af5"/>
         <w:ind w:firstLine="708"/>
-        <w:rPr>
-          <w:b/>
-          <w:bCs/>
-        </w:rPr>
-      </w:pPr>
+      </w:pPr>
+      <w:r>
+        <w:t>Просмотр истории сортировок реализован в виде отдельного диалогового окна с таблицей. Пользователь видит дату операции, исходный массив и результат сортировки. Данные отображаются в наглядной табличной форме, что снижает когнитивную нагрузку.</w:t>
+      </w:r>
     </w:p>
     <w:p>
       <w:pPr>
         <w:pStyle w:val="af5"/>
         <w:ind w:firstLine="708"/>
       </w:pPr>
-      <w:r>
-        <w:t>Просмотр истории сортировок реализован в виде отдельного диалогового окна с таблицей. Пользователь видит дату операции, исходный массив и результат сортировки. Данные отображаются в наглядной табличной форме, что снижает когнитивную нагрузку.</w:t>
-      </w:r>
     </w:p>
     <w:p>
       <w:pPr>
@@ -3886,110 +4202,216 @@
     </w:p>
     <w:p>
       <w:pPr>
-        <w:pStyle w:val="af5"/>
-        <w:ind w:left="708" w:firstLine="0"/>
-      </w:pPr>
-      <w:r>
-        <w:t xml:space="preserve">Интерфейс приложения соответствует базовым эвристикам </w:t>
-      </w:r>
-      <w:r>
-        <w:rPr>
-          <w:lang w:val="en-US"/>
-        </w:rPr>
-        <w:t>UI</w:t>
-      </w:r>
-      <w:r>
-        <w:t>/</w:t>
-      </w:r>
-      <w:r>
-        <w:rPr>
-          <w:lang w:val="en-US"/>
-        </w:rPr>
-        <w:t>UX</w:t>
-      </w:r>
-      <w:r>
-        <w:t>:</w:t>
-      </w:r>
-      <w:r>
-        <w:br/>
-      </w:r>
-      <w:r>
-        <w:t xml:space="preserve">1) </w:t>
-      </w:r>
-      <w:r>
-        <w:t>Видимость состояния системы обеспечивается сообщениями и обновлением</w:t>
-      </w:r>
-      <w:r>
-        <w:t xml:space="preserve"> </w:t>
-      </w:r>
-      <w:r>
-        <w:t>интерфейса.</w:t>
-      </w:r>
-      <w:r>
-        <w:br/>
-      </w:r>
-      <w:r>
-        <w:t xml:space="preserve">2) </w:t>
-      </w:r>
-      <w:r>
-        <w:t>Предотвращение ошибок реализовано через ограничение ввода.</w:t>
-      </w:r>
-      <w:r>
-        <w:br/>
-      </w:r>
-      <w:r>
-        <w:t xml:space="preserve">3) </w:t>
-      </w:r>
-      <w:r>
-        <w:t>Контроль и свобода пользователя обеспечиваются кнопками очистки, отмены и закрытия окон.</w:t>
-      </w:r>
-      <w:r>
-        <w:br/>
-      </w:r>
-      <w:r>
-        <w:t xml:space="preserve">4) </w:t>
-      </w:r>
-      <w:r>
-        <w:t xml:space="preserve">Последовательность и стандарты соблюдаются за счёт использования стандартных компонентов </w:t>
-      </w:r>
-      <w:r>
-        <w:rPr>
-          <w:lang w:val="en-US"/>
+        <w:spacing w:after="0" w:line="240" w:lineRule="auto"/>
+        <w:ind w:firstLine="708"/>
+        <w:jc w:val="both"/>
+        <w:rPr>
+          <w:rFonts w:ascii="Times New Roman" w:eastAsia="SimSun" w:hAnsi="Times New Roman" w:cs="Arial"/>
+          <w:kern w:val="1"/>
+          <w:sz w:val="24"/>
+          <w:szCs w:val="24"/>
+          <w:lang w:eastAsia="zh-CN" w:bidi="hi-IN"/>
+        </w:rPr>
+      </w:pPr>
+      <w:r>
+        <w:rPr>
+          <w:rFonts w:ascii="Times New Roman" w:eastAsia="SimSun" w:hAnsi="Times New Roman" w:cs="Arial"/>
+          <w:kern w:val="1"/>
+          <w:sz w:val="24"/>
+          <w:szCs w:val="24"/>
+          <w:lang w:eastAsia="zh-CN" w:bidi="hi-IN"/>
+        </w:rPr>
+        <w:t>1)</w:t>
+      </w:r>
+      <w:r>
+        <w:rPr>
+          <w:rFonts w:ascii="Times New Roman" w:eastAsia="SimSun" w:hAnsi="Times New Roman" w:cs="Arial"/>
+          <w:kern w:val="1"/>
+          <w:sz w:val="24"/>
+          <w:szCs w:val="24"/>
+          <w:lang w:eastAsia="zh-CN" w:bidi="hi-IN"/>
+        </w:rPr>
+        <w:t xml:space="preserve"> Видимость состояния системы обеспечивается информационными сообщениями и визуальным обновлением элементов интерфейса.</w:t>
+      </w:r>
+    </w:p>
+    <w:p>
+      <w:pPr>
+        <w:spacing w:after="0" w:line="240" w:lineRule="auto"/>
+        <w:ind w:firstLine="708"/>
+        <w:jc w:val="both"/>
+        <w:rPr>
+          <w:rFonts w:ascii="Times New Roman" w:eastAsia="SimSun" w:hAnsi="Times New Roman" w:cs="Arial"/>
+          <w:kern w:val="1"/>
+          <w:sz w:val="24"/>
+          <w:szCs w:val="24"/>
+          <w:lang w:eastAsia="zh-CN" w:bidi="hi-IN"/>
+        </w:rPr>
+      </w:pPr>
+      <w:r>
+        <w:rPr>
+          <w:rFonts w:ascii="Times New Roman" w:eastAsia="SimSun" w:hAnsi="Times New Roman" w:cs="Arial"/>
+          <w:kern w:val="1"/>
+          <w:sz w:val="24"/>
+          <w:szCs w:val="24"/>
+          <w:lang w:eastAsia="zh-CN" w:bidi="hi-IN"/>
+        </w:rPr>
+        <w:t>2)</w:t>
+      </w:r>
+      <w:r>
+        <w:rPr>
+          <w:rFonts w:ascii="Times New Roman" w:eastAsia="SimSun" w:hAnsi="Times New Roman" w:cs="Arial"/>
+          <w:kern w:val="1"/>
+          <w:sz w:val="24"/>
+          <w:szCs w:val="24"/>
+          <w:lang w:eastAsia="zh-CN" w:bidi="hi-IN"/>
+        </w:rPr>
+        <w:t xml:space="preserve"> Предотвращение ошибок реализовано за счёт ограничения ввода и проверки корректности данных.</w:t>
+      </w:r>
+    </w:p>
+    <w:p>
+      <w:pPr>
+        <w:spacing w:after="0" w:line="240" w:lineRule="auto"/>
+        <w:ind w:firstLine="708"/>
+        <w:jc w:val="both"/>
+        <w:rPr>
+          <w:rFonts w:ascii="Times New Roman" w:eastAsia="SimSun" w:hAnsi="Times New Roman" w:cs="Arial"/>
+          <w:kern w:val="1"/>
+          <w:sz w:val="24"/>
+          <w:szCs w:val="24"/>
+          <w:lang w:eastAsia="zh-CN" w:bidi="hi-IN"/>
+        </w:rPr>
+      </w:pPr>
+      <w:r>
+        <w:rPr>
+          <w:rFonts w:ascii="Times New Roman" w:eastAsia="SimSun" w:hAnsi="Times New Roman" w:cs="Arial"/>
+          <w:kern w:val="1"/>
+          <w:sz w:val="24"/>
+          <w:szCs w:val="24"/>
+          <w:lang w:eastAsia="zh-CN" w:bidi="hi-IN"/>
+        </w:rPr>
+        <w:t>3)</w:t>
+      </w:r>
+      <w:r>
+        <w:rPr>
+          <w:rFonts w:ascii="Times New Roman" w:eastAsia="SimSun" w:hAnsi="Times New Roman" w:cs="Arial"/>
+          <w:kern w:val="1"/>
+          <w:sz w:val="24"/>
+          <w:szCs w:val="24"/>
+          <w:lang w:eastAsia="zh-CN" w:bidi="hi-IN"/>
+        </w:rPr>
+        <w:t xml:space="preserve"> Контроль и свобода пользователя обеспечиваются наличием кнопок очистки, отмены и закрытия окон.</w:t>
+      </w:r>
+    </w:p>
+    <w:p>
+      <w:pPr>
+        <w:spacing w:after="0" w:line="240" w:lineRule="auto"/>
+        <w:ind w:firstLine="708"/>
+        <w:jc w:val="both"/>
+        <w:rPr>
+          <w:rFonts w:ascii="Times New Roman" w:eastAsia="SimSun" w:hAnsi="Times New Roman" w:cs="Arial"/>
+          <w:kern w:val="1"/>
+          <w:sz w:val="24"/>
+          <w:szCs w:val="24"/>
+          <w:lang w:eastAsia="zh-CN" w:bidi="hi-IN"/>
+        </w:rPr>
+      </w:pPr>
+      <w:r>
+        <w:rPr>
+          <w:rFonts w:ascii="Times New Roman" w:eastAsia="SimSun" w:hAnsi="Times New Roman" w:cs="Arial"/>
+          <w:kern w:val="1"/>
+          <w:sz w:val="24"/>
+          <w:szCs w:val="24"/>
+          <w:lang w:eastAsia="zh-CN" w:bidi="hi-IN"/>
+        </w:rPr>
+        <w:t>4)</w:t>
+      </w:r>
+      <w:r>
+        <w:rPr>
+          <w:rFonts w:ascii="Times New Roman" w:eastAsia="SimSun" w:hAnsi="Times New Roman" w:cs="Arial"/>
+          <w:kern w:val="1"/>
+          <w:sz w:val="24"/>
+          <w:szCs w:val="24"/>
+          <w:lang w:eastAsia="zh-CN" w:bidi="hi-IN"/>
+        </w:rPr>
+        <w:t xml:space="preserve"> Последовательность и стандарты соблюдаются за счёт использования стандартных компонентов библиотеки </w:t>
+      </w:r>
+      <w:proofErr w:type="spellStart"/>
+      <w:r>
+        <w:rPr>
+          <w:rFonts w:ascii="Times New Roman" w:eastAsia="SimSun" w:hAnsi="Times New Roman" w:cs="Arial"/>
+          <w:kern w:val="1"/>
+          <w:sz w:val="24"/>
+          <w:szCs w:val="24"/>
+          <w:lang w:eastAsia="zh-CN" w:bidi="hi-IN"/>
         </w:rPr>
         <w:t>Qt</w:t>
       </w:r>
-      <w:r>
+      <w:proofErr w:type="spellEnd"/>
+      <w:r>
+        <w:rPr>
+          <w:rFonts w:ascii="Times New Roman" w:eastAsia="SimSun" w:hAnsi="Times New Roman" w:cs="Arial"/>
+          <w:kern w:val="1"/>
+          <w:sz w:val="24"/>
+          <w:szCs w:val="24"/>
+          <w:lang w:eastAsia="zh-CN" w:bidi="hi-IN"/>
+        </w:rPr>
         <w:t>.</w:t>
       </w:r>
-      <w:r>
-        <w:br/>
-      </w:r>
-      <w:r>
+    </w:p>
+    <w:p>
+      <w:pPr>
+        <w:spacing w:after="0" w:line="240" w:lineRule="auto"/>
+        <w:ind w:firstLine="708"/>
+        <w:jc w:val="both"/>
+        <w:rPr>
+          <w:rFonts w:ascii="Times New Roman" w:eastAsia="SimSun" w:hAnsi="Times New Roman" w:cs="Arial"/>
+          <w:kern w:val="1"/>
+          <w:sz w:val="24"/>
+          <w:szCs w:val="24"/>
+          <w:lang w:eastAsia="zh-CN" w:bidi="hi-IN"/>
+        </w:rPr>
+      </w:pPr>
+      <w:r>
+        <w:rPr>
+          <w:rFonts w:ascii="Times New Roman" w:eastAsia="SimSun" w:hAnsi="Times New Roman" w:cs="Arial"/>
+          <w:kern w:val="1"/>
+          <w:sz w:val="24"/>
+          <w:szCs w:val="24"/>
+          <w:lang w:eastAsia="zh-CN" w:bidi="hi-IN"/>
+        </w:rPr>
         <w:t>5)</w:t>
       </w:r>
       <w:r>
-        <w:t xml:space="preserve"> Узнавание вместо запоминания достигается за счёт визуальных элементов и понятных подписей.</w:t>
-      </w:r>
-    </w:p>
-    <w:p>
-      <w:pPr>
-        <w:pStyle w:val="af5"/>
-        <w:ind w:firstLine="708"/>
-        <w:rPr>
+        <w:rPr>
+          <w:rFonts w:ascii="Times New Roman" w:eastAsia="SimSun" w:hAnsi="Times New Roman" w:cs="Arial"/>
+          <w:kern w:val="1"/>
+          <w:sz w:val="24"/>
+          <w:szCs w:val="24"/>
+          <w:lang w:eastAsia="zh-CN" w:bidi="hi-IN"/>
+        </w:rPr>
+        <w:t xml:space="preserve"> Узнавание вместо запоминания достигается благодаря визуальным элементам и понятным подписям.</w:t>
+      </w:r>
+    </w:p>
+    <w:p>
+      <w:pPr>
+        <w:spacing w:after="0" w:line="240" w:lineRule="auto"/>
+        <w:rPr>
+          <w:rFonts w:ascii="Times New Roman" w:eastAsia="SimSun" w:hAnsi="Times New Roman" w:cs="Arial"/>
           <w:b/>
           <w:bCs/>
-        </w:rPr>
-      </w:pPr>
-    </w:p>
-    <w:p>
-      <w:pPr>
-        <w:pStyle w:val="af5"/>
-        <w:ind w:firstLine="708"/>
+          <w:kern w:val="1"/>
+          <w:sz w:val="24"/>
+          <w:szCs w:val="24"/>
+          <w:lang w:eastAsia="zh-CN" w:bidi="hi-IN"/>
+        </w:rPr>
+      </w:pPr>
+      <w:r>
         <w:rPr>
           <w:b/>
           <w:bCs/>
         </w:rPr>
-      </w:pPr>
+        <w:br w:type="page"/>
+      </w:r>
     </w:p>
     <w:p>
       <w:pPr>
@@ -4000,246 +4422,143 @@
           <w:bCs/>
         </w:rPr>
       </w:pPr>
-    </w:p>
-    <w:p>
-      <w:pPr>
-        <w:pStyle w:val="af5"/>
-        <w:ind w:firstLine="708"/>
+      <w:r>
         <w:rPr>
           <w:b/>
           <w:bCs/>
         </w:rPr>
-      </w:pPr>
-    </w:p>
-    <w:p>
-      <w:pPr>
-        <w:pStyle w:val="af5"/>
-        <w:ind w:firstLine="708"/>
+        <w:lastRenderedPageBreak/>
+        <w:t xml:space="preserve">6 </w:t>
+      </w:r>
+      <w:r>
         <w:rPr>
           <w:b/>
           <w:bCs/>
         </w:rPr>
-      </w:pPr>
-    </w:p>
-    <w:p>
-      <w:pPr>
-        <w:pStyle w:val="af5"/>
-        <w:ind w:firstLine="708"/>
+        <w:t>Вывод</w:t>
+      </w:r>
+      <w:r>
         <w:rPr>
           <w:b/>
           <w:bCs/>
         </w:rPr>
-      </w:pPr>
-    </w:p>
-    <w:p>
-      <w:pPr>
-        <w:pStyle w:val="af5"/>
-        <w:ind w:firstLine="708"/>
+        <w:t>ы по работе</w:t>
+      </w:r>
+      <w:r>
         <w:rPr>
           <w:b/>
           <w:bCs/>
         </w:rPr>
-      </w:pPr>
+        <w:t>:</w:t>
+      </w:r>
     </w:p>
     <w:p>
       <w:pPr>
         <w:pStyle w:val="af5"/>
         <w:ind w:firstLine="708"/>
-        <w:rPr>
-          <w:b/>
-          <w:bCs/>
-        </w:rPr>
-      </w:pPr>
+      </w:pPr>
+      <w:r>
+        <w:t xml:space="preserve">В процессе анализа поставленной задачи и определении проблемы было решено, из великого многообразия фреймворков и баз данных выбрать именно </w:t>
+      </w:r>
+      <w:r>
+        <w:rPr>
+          <w:lang w:val="en-US"/>
+        </w:rPr>
+        <w:t>Qt</w:t>
+      </w:r>
+      <w:r>
+        <w:t xml:space="preserve"> </w:t>
+      </w:r>
+      <w:r>
+        <w:t xml:space="preserve">и </w:t>
+      </w:r>
+      <w:r>
+        <w:rPr>
+          <w:lang w:val="en-US"/>
+        </w:rPr>
+        <w:t>MySQL</w:t>
+      </w:r>
+      <w:r>
+        <w:t xml:space="preserve"> из-за возможности тонкой настройки элементов интерфейса благодаря мощности языка </w:t>
+      </w:r>
+      <w:r>
+        <w:rPr>
+          <w:lang w:val="en-US"/>
+        </w:rPr>
+        <w:t>C</w:t>
+      </w:r>
+      <w:r>
+        <w:t>++</w:t>
+      </w:r>
+      <w:r>
+        <w:t xml:space="preserve">. В качестве обеспечения надёжного хранения данных была выбрана реляционная база данных </w:t>
+      </w:r>
+      <w:r>
+        <w:rPr>
+          <w:lang w:val="en-US"/>
+        </w:rPr>
+        <w:t>MySQL</w:t>
+      </w:r>
+      <w:r>
+        <w:t xml:space="preserve">, тем более что </w:t>
+      </w:r>
+      <w:r>
+        <w:rPr>
+          <w:lang w:val="en-US"/>
+        </w:rPr>
+        <w:t>Qt</w:t>
+      </w:r>
+      <w:r>
+        <w:t xml:space="preserve"> </w:t>
+      </w:r>
+      <w:r>
+        <w:t>предоставляет плагины для и библиотеки для связи с базой данных.</w:t>
+      </w:r>
     </w:p>
     <w:p>
       <w:pPr>
         <w:pStyle w:val="af5"/>
         <w:ind w:firstLine="708"/>
         <w:rPr>
-          <w:b/>
-          <w:bCs/>
-        </w:rPr>
-      </w:pPr>
-    </w:p>
-    <w:p>
-      <w:pPr>
-        <w:pStyle w:val="af5"/>
-        <w:ind w:firstLine="708"/>
-        <w:rPr>
-          <w:b/>
-          <w:bCs/>
-        </w:rPr>
-      </w:pPr>
-    </w:p>
-    <w:p>
-      <w:pPr>
-        <w:pStyle w:val="af5"/>
-        <w:ind w:firstLine="708"/>
-        <w:rPr>
-          <w:b/>
-          <w:bCs/>
-        </w:rPr>
-      </w:pPr>
-    </w:p>
-    <w:p>
-      <w:pPr>
-        <w:pStyle w:val="af5"/>
-        <w:ind w:firstLine="708"/>
-        <w:rPr>
-          <w:b/>
-          <w:bCs/>
-        </w:rPr>
-      </w:pPr>
-      <w:r>
-        <w:rPr>
-          <w:b/>
-          <w:bCs/>
-        </w:rPr>
-        <w:lastRenderedPageBreak/>
-        <w:t xml:space="preserve">6 </w:t>
-      </w:r>
-      <w:r>
-        <w:rPr>
-          <w:b/>
-          <w:bCs/>
-        </w:rPr>
-        <w:t>Вывод</w:t>
-      </w:r>
-      <w:r>
-        <w:rPr>
-          <w:b/>
-          <w:bCs/>
-        </w:rPr>
-        <w:t>ы по работе</w:t>
-      </w:r>
-      <w:r>
-        <w:rPr>
-          <w:b/>
-          <w:bCs/>
-        </w:rPr>
-        <w:t>:</w:t>
-      </w:r>
-    </w:p>
-    <w:p>
-      <w:pPr>
-        <w:pStyle w:val="af5"/>
-        <w:ind w:firstLine="708"/>
-      </w:pPr>
-      <w:r>
-        <w:t xml:space="preserve">В процессе анализа поставленной задачи и определении проблемы было решено, из великого многообразия фреймворков и баз данных выбрать именно </w:t>
-      </w:r>
-      <w:r>
-        <w:rPr>
           <w:lang w:val="en-US"/>
         </w:rPr>
-        <w:t>Qt</w:t>
+      </w:pPr>
+      <w:r>
+        <w:t xml:space="preserve">В процессе разработки пришлось столкнуться с множеством проблем и неопределённостей ввиду только лишь освоения инструментов </w:t>
+      </w:r>
+      <w:r>
+        <w:rPr>
+          <w:lang w:val="en-US"/>
+        </w:rPr>
+        <w:t>desktop</w:t>
       </w:r>
       <w:r>
         <w:t xml:space="preserve"> </w:t>
       </w:r>
       <w:r>
-        <w:t xml:space="preserve">и </w:t>
+        <w:t>разработки. Однако р</w:t>
+      </w:r>
+      <w:r>
+        <w:t xml:space="preserve">азработанный графический интерфейс является интуитивно понятным, логически последовательным и ориентированным на пользователя. Он снижает вероятность ошибок, обеспечивает удобство работы и соответствует основным принципам </w:t>
       </w:r>
       <w:r>
         <w:rPr>
           <w:lang w:val="en-US"/>
         </w:rPr>
-        <w:t>MySQL</w:t>
-      </w:r>
-      <w:r>
-        <w:t xml:space="preserve"> из-за возможности тонкой настройки элементов интерфейса благодаря мощности языка </w:t>
+        <w:t>UI</w:t>
+      </w:r>
+      <w:r>
+        <w:t>/</w:t>
       </w:r>
       <w:r>
         <w:rPr>
           <w:lang w:val="en-US"/>
         </w:rPr>
-        <w:t>C</w:t>
-      </w:r>
-      <w:r>
-        <w:t>++</w:t>
-      </w:r>
-      <w:r>
-        <w:t xml:space="preserve">. В качестве обеспечения надёжного хранения данных была выбрана реляционная база данных </w:t>
-      </w:r>
-      <w:r>
-        <w:rPr>
-          <w:lang w:val="en-US"/>
-        </w:rPr>
-        <w:t>MySQL</w:t>
-      </w:r>
-      <w:r>
-        <w:t xml:space="preserve">, тем более что </w:t>
-      </w:r>
-      <w:r>
-        <w:rPr>
-          <w:lang w:val="en-US"/>
-        </w:rPr>
-        <w:t>Qt</w:t>
-      </w:r>
-      <w:r>
-        <w:t xml:space="preserve"> </w:t>
-      </w:r>
-      <w:r>
-        <w:t>предоставляет плагины для и библиотеки для связи с базой данных.</w:t>
-      </w:r>
-    </w:p>
-    <w:p>
-      <w:pPr>
-        <w:pStyle w:val="af5"/>
-        <w:ind w:firstLine="708"/>
-      </w:pPr>
-      <w:r>
-        <w:t xml:space="preserve">В процессе разработки пришлось столкнуться с множеством проблем и неопределённостей ввиду только лишь освоения инструментов </w:t>
-      </w:r>
-      <w:r>
-        <w:rPr>
-          <w:lang w:val="en-US"/>
-        </w:rPr>
-        <w:t>desktop</w:t>
-      </w:r>
-      <w:r>
-        <w:t xml:space="preserve"> </w:t>
-      </w:r>
-      <w:r>
-        <w:t>разработки. Однако р</w:t>
-      </w:r>
-      <w:r>
-        <w:t xml:space="preserve">азработанный графический интерфейс является интуитивно понятным, логически последовательным и ориентированным на пользователя. Он снижает вероятность ошибок, обеспечивает удобство работы и соответствует основным принципам </w:t>
-      </w:r>
-      <w:r>
-        <w:rPr>
-          <w:lang w:val="en-US"/>
-        </w:rPr>
-        <w:t>UI</w:t>
-      </w:r>
-      <w:r>
-        <w:t>/</w:t>
-      </w:r>
-      <w:r>
-        <w:rPr>
-          <w:lang w:val="en-US"/>
-        </w:rPr>
         <w:t>UX</w:t>
       </w:r>
       <w:r>
         <w:t xml:space="preserve"> проектирования.</w:t>
       </w:r>
-      <w:r>
-        <w:t xml:space="preserve"> </w:t>
-      </w:r>
-      <w:r>
-        <w:rPr>
-          <w:b/>
-          <w:bCs/>
-        </w:rPr>
-        <w:br/>
-      </w:r>
-    </w:p>
-    <w:p>
-      <w:pPr>
-        <w:pStyle w:val="af5"/>
-        <w:ind w:firstLine="0"/>
-      </w:pPr>
     </w:p>
     <w:sectPr>
       <w:footerReference w:type="default" r:id="rId17"/>
@@ -6099,7 +6418,6 @@
   <w:style w:type="character" w:default="1" w:styleId="a0">
     <w:name w:val="Default Paragraph Font"/>
     <w:uiPriority w:val="1"/>
-    <w:semiHidden/>
     <w:unhideWhenUsed/>
   </w:style>
   <w:style w:type="table" w:default="1" w:styleId="a1">

</xml_diff>